<commit_message>
fix: 合作协议调整——LIVANTO为委托方在前，FREDDY名称为FREDDY (SHANGHAI) INFORMATION CONSULTING LTD. HN
</commit_message>
<xml_diff>
--- a/projects/contracts/FREDDY-LIVANTO/Kooperationsvereinbarung_FREDDY-LIVANTO.docx
+++ b/projects/contracts/FREDDY-LIVANTO/Kooperationsvereinbarung_FREDDY-LIVANTO.docx
@@ -146,7 +146,7 @@
                 <w:b w:val="0"/>
                 <w:sz w:val="21"/>
               </w:rPr>
-              <w:t>(1) FREDDY (SHANGHAI) INFORMATION CONSULTING LTD., Zweigniederlassung Huainan, Nr. 21, Longhu Road, Huainan, Anhui, Volksrepublik China, handelnd durch ihre Hauptniederlassung FREDDY (SHANGHAI) INFORMATION CONSULTING LTD.</w:t>
+              <w:t>(1) LIVANTO GmbH, Luisenhoffnung 3C, 44225 Dortmund, Deutschland, eingetragen im Handelsregister des Amtsgerichts Dortmund unter HRB 38628, Umsatzsteuer-Identifikationsnummer DE 464031041, vertreten durch ihren Geschäftsführer Zifeng Qian, – als Auftraggeberin –</w:t>
             </w:r>
           </w:p>
         </w:tc>
@@ -172,7 +172,169 @@
                 <w:b w:val="0"/>
                 <w:sz w:val="21"/>
               </w:rPr>
-              <w:t>(1) 福瑞笛（上海）信息咨询有限公司淮南分公司，地址：中华人民共和国安徽省淮南市龙湖路21号，由其总公司福瑞笛（上海）信息咨询有限公司授权行事</w:t>
+              <w:t>(1) LIVANTO 有限责任公司，地址：德国多特蒙德 Luisenhoffnung 3C（邮编 44225），于多特蒙德地方法院商业登记处登记（登记号 HRB 38628），增值税识别号 DE 464031041，由总经理钱子风代表 —— 作为委托方 ——</w:t>
+            </w:r>
+          </w:p>
+        </w:tc>
+      </w:tr>
+      <w:tr>
+        <w:tc>
+          <w:tcPr>
+            <w:tcW w:type="dxa" w:w="4819"/>
+            <w:tcBorders>
+              <w:top w:val="nil"/>
+              <w:left w:val="nil"/>
+              <w:bottom w:val="nil"/>
+              <w:right w:val="nil"/>
+              <w:insideH w:val="nil"/>
+              <w:insideV w:val="nil"/>
+            </w:tcBorders>
+          </w:tcPr>
+          <w:p>
+            <w:pPr>
+              <w:spacing w:after="40" w:before="0"/>
+            </w:pPr>
+            <w:r>
+              <w:rPr>
+                <w:rFonts w:ascii="Times New Roman" w:hAnsi="Times New Roman" w:eastAsia="宋体" w:cs="Times New Roman"/>
+                <w:b w:val="0"/>
+                <w:sz w:val="21"/>
+              </w:rPr>
+              <w:t>– nachfolgend „LIVANTO“ genannt –,</w:t>
+            </w:r>
+          </w:p>
+        </w:tc>
+        <w:tc>
+          <w:tcPr>
+            <w:tcW w:type="dxa" w:w="4819"/>
+            <w:tcBorders>
+              <w:top w:val="nil"/>
+              <w:left w:val="nil"/>
+              <w:bottom w:val="nil"/>
+              <w:right w:val="nil"/>
+              <w:insideH w:val="nil"/>
+              <w:insideV w:val="nil"/>
+            </w:tcBorders>
+          </w:tcPr>
+          <w:p>
+            <w:pPr>
+              <w:spacing w:after="40" w:before="0"/>
+            </w:pPr>
+            <w:r>
+              <w:rPr>
+                <w:rFonts w:ascii="Times New Roman" w:hAnsi="Times New Roman" w:eastAsia="宋体" w:cs="Times New Roman"/>
+                <w:b w:val="0"/>
+                <w:sz w:val="21"/>
+              </w:rPr>
+              <w:t>—— 以下称“LIVANTO”——，</w:t>
+            </w:r>
+          </w:p>
+        </w:tc>
+      </w:tr>
+      <w:tr>
+        <w:tc>
+          <w:tcPr>
+            <w:tcW w:type="dxa" w:w="4819"/>
+            <w:tcBorders>
+              <w:top w:val="nil"/>
+              <w:left w:val="nil"/>
+              <w:bottom w:val="nil"/>
+              <w:right w:val="nil"/>
+              <w:insideH w:val="nil"/>
+              <w:insideV w:val="nil"/>
+            </w:tcBorders>
+          </w:tcPr>
+          <w:p>
+            <w:pPr>
+              <w:spacing w:after="40" w:before="0"/>
+            </w:pPr>
+            <w:r>
+              <w:rPr>
+                <w:rFonts w:ascii="Times New Roman" w:hAnsi="Times New Roman" w:eastAsia="宋体" w:cs="Times New Roman"/>
+                <w:b w:val="0"/>
+                <w:sz w:val="21"/>
+              </w:rPr>
+              <w:t>und</w:t>
+            </w:r>
+          </w:p>
+        </w:tc>
+        <w:tc>
+          <w:tcPr>
+            <w:tcW w:type="dxa" w:w="4819"/>
+            <w:tcBorders>
+              <w:top w:val="nil"/>
+              <w:left w:val="nil"/>
+              <w:bottom w:val="nil"/>
+              <w:right w:val="nil"/>
+              <w:insideH w:val="nil"/>
+              <w:insideV w:val="nil"/>
+            </w:tcBorders>
+          </w:tcPr>
+          <w:p>
+            <w:pPr>
+              <w:spacing w:after="40" w:before="0"/>
+            </w:pPr>
+            <w:r>
+              <w:rPr>
+                <w:rFonts w:ascii="Times New Roman" w:hAnsi="Times New Roman" w:eastAsia="宋体" w:cs="Times New Roman"/>
+                <w:b w:val="0"/>
+                <w:sz w:val="21"/>
+              </w:rPr>
+              <w:t>与</w:t>
+            </w:r>
+          </w:p>
+        </w:tc>
+      </w:tr>
+      <w:tr>
+        <w:tc>
+          <w:tcPr>
+            <w:tcW w:type="dxa" w:w="4819"/>
+            <w:tcBorders>
+              <w:top w:val="nil"/>
+              <w:left w:val="nil"/>
+              <w:bottom w:val="nil"/>
+              <w:right w:val="nil"/>
+              <w:insideH w:val="nil"/>
+              <w:insideV w:val="nil"/>
+            </w:tcBorders>
+          </w:tcPr>
+          <w:p>
+            <w:pPr>
+              <w:spacing w:after="40" w:before="0"/>
+            </w:pPr>
+            <w:r>
+              <w:rPr>
+                <w:rFonts w:ascii="Times New Roman" w:hAnsi="Times New Roman" w:eastAsia="宋体" w:cs="Times New Roman"/>
+                <w:b w:val="0"/>
+                <w:sz w:val="21"/>
+              </w:rPr>
+              <w:t>(2) FREDDY (SHANGHAI) INFORMATION CONSULTING LTD. HN, Zweigniederlassung Huainan, Nr. 21, Longhu Road, Huainan, Anhui, Volksrepublik China, handelnd durch ihre Hauptniederlassung FREDDY (SHANGHAI) INFORMATION CONSULTING LTD., – als Auftragnehmerin –</w:t>
+            </w:r>
+          </w:p>
+        </w:tc>
+        <w:tc>
+          <w:tcPr>
+            <w:tcW w:type="dxa" w:w="4819"/>
+            <w:tcBorders>
+              <w:top w:val="nil"/>
+              <w:left w:val="nil"/>
+              <w:bottom w:val="nil"/>
+              <w:right w:val="nil"/>
+              <w:insideH w:val="nil"/>
+              <w:insideV w:val="nil"/>
+            </w:tcBorders>
+          </w:tcPr>
+          <w:p>
+            <w:pPr>
+              <w:spacing w:after="40" w:before="0"/>
+            </w:pPr>
+            <w:r>
+              <w:rPr>
+                <w:rFonts w:ascii="Times New Roman" w:hAnsi="Times New Roman" w:eastAsia="宋体" w:cs="Times New Roman"/>
+                <w:b w:val="0"/>
+                <w:sz w:val="21"/>
+              </w:rPr>
+              <w:t>(2) FREDDY (SHANGHAI) INFORMATION CONSULTING LTD. HN（福瑞笛（上海）信息咨询有限公司淮南分公司），地址：中华人民共和国安徽省淮南市龙湖路21号，由其总公司福瑞笛（上海）信息咨询有限公司授权行事 —— 作为受托方 ——</w:t>
             </w:r>
           </w:p>
         </w:tc>
@@ -254,7 +416,7 @@
                 <w:b w:val="0"/>
                 <w:sz w:val="21"/>
               </w:rPr>
-              <w:t>und</w:t>
+              <w:t>– LIVANTO und FREDDY gemeinsam nachfolgend auch „Parteien“ genannt –</w:t>
             </w:r>
           </w:p>
         </w:tc>
@@ -280,169 +442,7 @@
                 <w:b w:val="0"/>
                 <w:sz w:val="21"/>
               </w:rPr>
-              <w:t>与</w:t>
-            </w:r>
-          </w:p>
-        </w:tc>
-      </w:tr>
-      <w:tr>
-        <w:tc>
-          <w:tcPr>
-            <w:tcW w:type="dxa" w:w="4819"/>
-            <w:tcBorders>
-              <w:top w:val="nil"/>
-              <w:left w:val="nil"/>
-              <w:bottom w:val="nil"/>
-              <w:right w:val="nil"/>
-              <w:insideH w:val="nil"/>
-              <w:insideV w:val="nil"/>
-            </w:tcBorders>
-          </w:tcPr>
-          <w:p>
-            <w:pPr>
-              <w:spacing w:after="40" w:before="0"/>
-            </w:pPr>
-            <w:r>
-              <w:rPr>
-                <w:rFonts w:ascii="Times New Roman" w:hAnsi="Times New Roman" w:eastAsia="宋体" w:cs="Times New Roman"/>
-                <w:b w:val="0"/>
-                <w:sz w:val="21"/>
-              </w:rPr>
-              <w:t>(2) LIVANTO GmbH, Luisenhoffnung 3C, 44225 Dortmund, Deutschland, eingetragen im Handelsregister des Amtsgerichts Dortmund unter HRB 38628, Umsatzsteuer-Identifikationsnummer DE 464031041, vertreten durch ihren Geschäftsführer Zifeng Qian,</w:t>
-            </w:r>
-          </w:p>
-        </w:tc>
-        <w:tc>
-          <w:tcPr>
-            <w:tcW w:type="dxa" w:w="4819"/>
-            <w:tcBorders>
-              <w:top w:val="nil"/>
-              <w:left w:val="nil"/>
-              <w:bottom w:val="nil"/>
-              <w:right w:val="nil"/>
-              <w:insideH w:val="nil"/>
-              <w:insideV w:val="nil"/>
-            </w:tcBorders>
-          </w:tcPr>
-          <w:p>
-            <w:pPr>
-              <w:spacing w:after="40" w:before="0"/>
-            </w:pPr>
-            <w:r>
-              <w:rPr>
-                <w:rFonts w:ascii="Times New Roman" w:hAnsi="Times New Roman" w:eastAsia="宋体" w:cs="Times New Roman"/>
-                <w:b w:val="0"/>
-                <w:sz w:val="21"/>
-              </w:rPr>
-              <w:t>(2) LIVANTO 有限责任公司，地址：德国多特蒙德 Luisenhoffnung 3C（邮编 44225），于多特蒙德地方法院商业登记处登记（登记号 HRB 38628），增值税识别号 DE 464031041，由总经理钱子风代表</w:t>
-            </w:r>
-          </w:p>
-        </w:tc>
-      </w:tr>
-      <w:tr>
-        <w:tc>
-          <w:tcPr>
-            <w:tcW w:type="dxa" w:w="4819"/>
-            <w:tcBorders>
-              <w:top w:val="nil"/>
-              <w:left w:val="nil"/>
-              <w:bottom w:val="nil"/>
-              <w:right w:val="nil"/>
-              <w:insideH w:val="nil"/>
-              <w:insideV w:val="nil"/>
-            </w:tcBorders>
-          </w:tcPr>
-          <w:p>
-            <w:pPr>
-              <w:spacing w:after="40" w:before="0"/>
-            </w:pPr>
-            <w:r>
-              <w:rPr>
-                <w:rFonts w:ascii="Times New Roman" w:hAnsi="Times New Roman" w:eastAsia="宋体" w:cs="Times New Roman"/>
-                <w:b w:val="0"/>
-                <w:sz w:val="21"/>
-              </w:rPr>
-              <w:t>– nachfolgend „LIVANTO“ genannt –,</w:t>
-            </w:r>
-          </w:p>
-        </w:tc>
-        <w:tc>
-          <w:tcPr>
-            <w:tcW w:type="dxa" w:w="4819"/>
-            <w:tcBorders>
-              <w:top w:val="nil"/>
-              <w:left w:val="nil"/>
-              <w:bottom w:val="nil"/>
-              <w:right w:val="nil"/>
-              <w:insideH w:val="nil"/>
-              <w:insideV w:val="nil"/>
-            </w:tcBorders>
-          </w:tcPr>
-          <w:p>
-            <w:pPr>
-              <w:spacing w:after="40" w:before="0"/>
-            </w:pPr>
-            <w:r>
-              <w:rPr>
-                <w:rFonts w:ascii="Times New Roman" w:hAnsi="Times New Roman" w:eastAsia="宋体" w:cs="Times New Roman"/>
-                <w:b w:val="0"/>
-                <w:sz w:val="21"/>
-              </w:rPr>
-              <w:t>—— 以下称“LIVANTO”——，</w:t>
-            </w:r>
-          </w:p>
-        </w:tc>
-      </w:tr>
-      <w:tr>
-        <w:tc>
-          <w:tcPr>
-            <w:tcW w:type="dxa" w:w="4819"/>
-            <w:tcBorders>
-              <w:top w:val="nil"/>
-              <w:left w:val="nil"/>
-              <w:bottom w:val="nil"/>
-              <w:right w:val="nil"/>
-              <w:insideH w:val="nil"/>
-              <w:insideV w:val="nil"/>
-            </w:tcBorders>
-          </w:tcPr>
-          <w:p>
-            <w:pPr>
-              <w:spacing w:after="40" w:before="0"/>
-            </w:pPr>
-            <w:r>
-              <w:rPr>
-                <w:rFonts w:ascii="Times New Roman" w:hAnsi="Times New Roman" w:eastAsia="宋体" w:cs="Times New Roman"/>
-                <w:b w:val="0"/>
-                <w:sz w:val="21"/>
-              </w:rPr>
-              <w:t>– FREDDY und LIVANTO gemeinsam nachfolgend auch „Parteien“ genannt –</w:t>
-            </w:r>
-          </w:p>
-        </w:tc>
-        <w:tc>
-          <w:tcPr>
-            <w:tcW w:type="dxa" w:w="4819"/>
-            <w:tcBorders>
-              <w:top w:val="nil"/>
-              <w:left w:val="nil"/>
-              <w:bottom w:val="nil"/>
-              <w:right w:val="nil"/>
-              <w:insideH w:val="nil"/>
-              <w:insideV w:val="nil"/>
-            </w:tcBorders>
-          </w:tcPr>
-          <w:p>
-            <w:pPr>
-              <w:spacing w:after="40" w:before="0"/>
-            </w:pPr>
-            <w:r>
-              <w:rPr>
-                <w:rFonts w:ascii="Times New Roman" w:hAnsi="Times New Roman" w:eastAsia="宋体" w:cs="Times New Roman"/>
-                <w:b w:val="0"/>
-                <w:sz w:val="21"/>
-              </w:rPr>
-              <w:t>—— 福瑞笛与 LIVANTO 以下合称“双方”——</w:t>
+              <w:t>—— LIVANTO 与福瑞笛以下合称“双方”——</w:t>
             </w:r>
           </w:p>
         </w:tc>
@@ -826,7 +826,7 @@
                 <w:b w:val="0"/>
                 <w:sz w:val="21"/>
               </w:rPr>
-              <w:t>(1) FREDDY handelt als Zweigniederlassung Huainan der FREDDY (SHANGHAI) INFORMATION CONSULTING LTD. und ist von ihrer Hauptniederlassung zur Unterzeichnung und Durchführung dieser Vereinbarung ermächtigt.</w:t>
+              <w:t>(1) LIVANTO verfügt über eine eingerichtete Niederlassung im Sinne des § 4 Absatz 3 GewO in Deutschland und ist als Bevollmächtigter im Verpackungsregister LUCID registriert (Bevollmächtigten-ID: DE8514687609035).</w:t>
             </w:r>
           </w:p>
         </w:tc>
@@ -852,7 +852,7 @@
                 <w:b w:val="0"/>
                 <w:sz w:val="21"/>
               </w:rPr>
-              <w:t>(1) 福瑞笛作为福瑞笛（上海）信息咨询有限公司的淮南分公司行事，并获其总公司授权签署和履行本合同。</w:t>
+              <w:t>(1) LIVANTO 在德国设有符合《营业条例》（GewO）第4条第3款规定的经营机构，并已在包装品登记处 LUCID 注册为授权代表（授权代表ID：DE8514687609035）。</w:t>
             </w:r>
           </w:p>
         </w:tc>
@@ -880,7 +880,7 @@
                 <w:b w:val="0"/>
                 <w:sz w:val="21"/>
               </w:rPr>
-              <w:t>(2) LIVANTO verfügt über eine eingerichtete Niederlassung im Sinne des § 4 Absatz 3 GewO in Deutschland und ist als Bevollmächtigter im Verpackungsregister LUCID registriert (Bevollmächtigten-ID: DE8514687609035).</w:t>
+              <w:t>(2) FREDDY handelt als Zweigniederlassung Huainan der FREDDY (SHANGHAI) INFORMATION CONSULTING LTD. („FREDDY (SHANGHAI) INFORMATION CONSULTING LTD. HN“) und ist von ihrer Hauptniederlassung zur Unterzeichnung und Durchführung dieser Vereinbarung ermächtigt.</w:t>
             </w:r>
           </w:p>
         </w:tc>
@@ -906,7 +906,7 @@
                 <w:b w:val="0"/>
                 <w:sz w:val="21"/>
               </w:rPr>
-              <w:t>(2) LIVANTO 在德国设有符合《营业条例》（GewO）第4条第3款规定的经营机构，并已在包装品登记处 LUCID 注册为授权代表（授权代表ID：DE8514687609035）。</w:t>
+              <w:t>(2) 福瑞笛作为福瑞笛（上海）信息咨询有限公司的淮南分公司（FREDDY (SHANGHAI) INFORMATION CONSULTING LTD. HN）行事，并获其总公司授权签署和履行本合同。</w:t>
             </w:r>
           </w:p>
         </w:tc>
@@ -1286,165 +1286,7 @@
                 <w:b w:val="0"/>
                 <w:sz w:val="21"/>
               </w:rPr>
-              <w:t>(1) FREDDY übernimmt insbesondere folgende Aufgaben:</w:t>
-            </w:r>
-          </w:p>
-          <w:p>
-            <w:pPr>
-              <w:spacing w:after="40" w:before="0"/>
-            </w:pPr>
-            <w:r>
-              <w:rPr>
-                <w:rFonts w:ascii="Times New Roman" w:hAnsi="Times New Roman" w:eastAsia="宋体" w:cs="Times New Roman"/>
-                <w:b w:val="0"/>
-                <w:sz w:val="21"/>
-              </w:rPr>
-              <w:t>a) Markterschließung und Kundenakquise im chinesischsprachigen Raum;</w:t>
-            </w:r>
-          </w:p>
-          <w:p>
-            <w:pPr>
-              <w:spacing w:after="40" w:before="0"/>
-            </w:pPr>
-            <w:r>
-              <w:rPr>
-                <w:rFonts w:ascii="Times New Roman" w:hAnsi="Times New Roman" w:eastAsia="宋体" w:cs="Times New Roman"/>
-                <w:b w:val="0"/>
-                <w:sz w:val="21"/>
-              </w:rPr>
-              <w:t>b) Kundenbetreuung, Kundenservice und laufende Kommunikation mit den Kunden;</w:t>
-            </w:r>
-          </w:p>
-          <w:p>
-            <w:pPr>
-              <w:spacing w:after="40" w:before="0"/>
-            </w:pPr>
-            <w:r>
-              <w:rPr>
-                <w:rFonts w:ascii="Times New Roman" w:hAnsi="Times New Roman" w:eastAsia="宋体" w:cs="Times New Roman"/>
-                <w:b w:val="0"/>
-                <w:sz w:val="21"/>
-              </w:rPr>
-              <w:t>c) Betrieb und Pflege des Online-Portals sowie der Vertrags- und Zahlungsabwicklung;</w:t>
-            </w:r>
-          </w:p>
-          <w:p>
-            <w:pPr>
-              <w:spacing w:after="40" w:before="0"/>
-            </w:pPr>
-            <w:r>
-              <w:rPr>
-                <w:rFonts w:ascii="Times New Roman" w:hAnsi="Times New Roman" w:eastAsia="宋体" w:cs="Times New Roman"/>
-                <w:b w:val="0"/>
-                <w:sz w:val="21"/>
-              </w:rPr>
-              <w:t>d) Einziehung sämtlicher von den Kunden zu leistenden Zahlungen und Weiterleitung gemäß § 4.</w:t>
-            </w:r>
-          </w:p>
-        </w:tc>
-        <w:tc>
-          <w:tcPr>
-            <w:tcW w:type="dxa" w:w="4819"/>
-            <w:tcBorders>
-              <w:top w:val="nil"/>
-              <w:left w:val="nil"/>
-              <w:bottom w:val="nil"/>
-              <w:right w:val="nil"/>
-              <w:insideH w:val="nil"/>
-              <w:insideV w:val="nil"/>
-            </w:tcBorders>
-          </w:tcPr>
-          <w:p>
-            <w:pPr>
-              <w:spacing w:after="40" w:before="0"/>
-            </w:pPr>
-            <w:r>
-              <w:rPr>
-                <w:rFonts w:ascii="Times New Roman" w:hAnsi="Times New Roman" w:eastAsia="宋体" w:cs="Times New Roman"/>
-                <w:b w:val="0"/>
-                <w:sz w:val="21"/>
-              </w:rPr>
-              <w:t>(1) 福瑞笛特别承担以下任务：</w:t>
-            </w:r>
-          </w:p>
-          <w:p>
-            <w:pPr>
-              <w:spacing w:after="40" w:before="0"/>
-            </w:pPr>
-            <w:r>
-              <w:rPr>
-                <w:rFonts w:ascii="Times New Roman" w:hAnsi="Times New Roman" w:eastAsia="宋体" w:cs="Times New Roman"/>
-                <w:b w:val="0"/>
-                <w:sz w:val="21"/>
-              </w:rPr>
-              <w:t>a) 中文地区的市场拓展与客户开发；</w:t>
-            </w:r>
-          </w:p>
-          <w:p>
-            <w:pPr>
-              <w:spacing w:after="40" w:before="0"/>
-            </w:pPr>
-            <w:r>
-              <w:rPr>
-                <w:rFonts w:ascii="Times New Roman" w:hAnsi="Times New Roman" w:eastAsia="宋体" w:cs="Times New Roman"/>
-                <w:b w:val="0"/>
-                <w:sz w:val="21"/>
-              </w:rPr>
-              <w:t>b) 客户维护、客户服务及与客户的日常沟通；</w:t>
-            </w:r>
-          </w:p>
-          <w:p>
-            <w:pPr>
-              <w:spacing w:after="40" w:before="0"/>
-            </w:pPr>
-            <w:r>
-              <w:rPr>
-                <w:rFonts w:ascii="Times New Roman" w:hAnsi="Times New Roman" w:eastAsia="宋体" w:cs="Times New Roman"/>
-                <w:b w:val="0"/>
-                <w:sz w:val="21"/>
-              </w:rPr>
-              <w:t>c) 在线门户的运营与维护，以及合同与支付处理；</w:t>
-            </w:r>
-          </w:p>
-          <w:p>
-            <w:pPr>
-              <w:spacing w:after="40" w:before="0"/>
-            </w:pPr>
-            <w:r>
-              <w:rPr>
-                <w:rFonts w:ascii="Times New Roman" w:hAnsi="Times New Roman" w:eastAsia="宋体" w:cs="Times New Roman"/>
-                <w:b w:val="0"/>
-                <w:sz w:val="21"/>
-              </w:rPr>
-              <w:t>d) 代收客户应付的全部款项，并按第4条转付。</w:t>
-            </w:r>
-          </w:p>
-        </w:tc>
-      </w:tr>
-      <w:tr>
-        <w:tc>
-          <w:tcPr>
-            <w:tcW w:type="dxa" w:w="4819"/>
-            <w:tcBorders>
-              <w:top w:val="nil"/>
-              <w:left w:val="nil"/>
-              <w:bottom w:val="nil"/>
-              <w:right w:val="nil"/>
-              <w:insideH w:val="nil"/>
-              <w:insideV w:val="nil"/>
-            </w:tcBorders>
-          </w:tcPr>
-          <w:p>
-            <w:pPr>
-              <w:spacing w:after="40" w:before="0"/>
-            </w:pPr>
-            <w:r>
-              <w:rPr>
-                <w:rFonts w:ascii="Times New Roman" w:hAnsi="Times New Roman" w:eastAsia="宋体" w:cs="Times New Roman"/>
-                <w:b w:val="0"/>
-                <w:sz w:val="21"/>
-              </w:rPr>
-              <w:t>(2) LIVANTO übernimmt insbesondere folgende Aufgaben:</w:t>
+              <w:t>(1) LIVANTO übernimmt insbesondere folgende Aufgaben:</w:t>
             </w:r>
           </w:p>
           <w:p>
@@ -1535,7 +1377,7 @@
                 <w:b w:val="0"/>
                 <w:sz w:val="21"/>
               </w:rPr>
-              <w:t>(2) LIVANTO 特别承担以下任务：</w:t>
+              <w:t>(1) LIVANTO 特别承担以下任务：</w:t>
             </w:r>
           </w:p>
           <w:p>
@@ -1601,6 +1443,164 @@
                 <w:sz w:val="21"/>
               </w:rPr>
               <w:t>e) 跟踪并传达法律框架的重大变更。</w:t>
+            </w:r>
+          </w:p>
+        </w:tc>
+      </w:tr>
+      <w:tr>
+        <w:tc>
+          <w:tcPr>
+            <w:tcW w:type="dxa" w:w="4819"/>
+            <w:tcBorders>
+              <w:top w:val="nil"/>
+              <w:left w:val="nil"/>
+              <w:bottom w:val="nil"/>
+              <w:right w:val="nil"/>
+              <w:insideH w:val="nil"/>
+              <w:insideV w:val="nil"/>
+            </w:tcBorders>
+          </w:tcPr>
+          <w:p>
+            <w:pPr>
+              <w:spacing w:after="40" w:before="0"/>
+            </w:pPr>
+            <w:r>
+              <w:rPr>
+                <w:rFonts w:ascii="Times New Roman" w:hAnsi="Times New Roman" w:eastAsia="宋体" w:cs="Times New Roman"/>
+                <w:b w:val="0"/>
+                <w:sz w:val="21"/>
+              </w:rPr>
+              <w:t>(2) FREDDY übernimmt insbesondere folgende Aufgaben:</w:t>
+            </w:r>
+          </w:p>
+          <w:p>
+            <w:pPr>
+              <w:spacing w:after="40" w:before="0"/>
+            </w:pPr>
+            <w:r>
+              <w:rPr>
+                <w:rFonts w:ascii="Times New Roman" w:hAnsi="Times New Roman" w:eastAsia="宋体" w:cs="Times New Roman"/>
+                <w:b w:val="0"/>
+                <w:sz w:val="21"/>
+              </w:rPr>
+              <w:t>a) Markterschließung und Kundenakquise im chinesischsprachigen Raum;</w:t>
+            </w:r>
+          </w:p>
+          <w:p>
+            <w:pPr>
+              <w:spacing w:after="40" w:before="0"/>
+            </w:pPr>
+            <w:r>
+              <w:rPr>
+                <w:rFonts w:ascii="Times New Roman" w:hAnsi="Times New Roman" w:eastAsia="宋体" w:cs="Times New Roman"/>
+                <w:b w:val="0"/>
+                <w:sz w:val="21"/>
+              </w:rPr>
+              <w:t>b) Kundenbetreuung, Kundenservice und laufende Kommunikation mit den Kunden;</w:t>
+            </w:r>
+          </w:p>
+          <w:p>
+            <w:pPr>
+              <w:spacing w:after="40" w:before="0"/>
+            </w:pPr>
+            <w:r>
+              <w:rPr>
+                <w:rFonts w:ascii="Times New Roman" w:hAnsi="Times New Roman" w:eastAsia="宋体" w:cs="Times New Roman"/>
+                <w:b w:val="0"/>
+                <w:sz w:val="21"/>
+              </w:rPr>
+              <w:t>c) Betrieb und Pflege des Online-Portals sowie der Vertrags- und Zahlungsabwicklung;</w:t>
+            </w:r>
+          </w:p>
+          <w:p>
+            <w:pPr>
+              <w:spacing w:after="40" w:before="0"/>
+            </w:pPr>
+            <w:r>
+              <w:rPr>
+                <w:rFonts w:ascii="Times New Roman" w:hAnsi="Times New Roman" w:eastAsia="宋体" w:cs="Times New Roman"/>
+                <w:b w:val="0"/>
+                <w:sz w:val="21"/>
+              </w:rPr>
+              <w:t>d) Einziehung sämtlicher von den Kunden zu leistenden Zahlungen und Weiterleitung gemäß § 4.</w:t>
+            </w:r>
+          </w:p>
+        </w:tc>
+        <w:tc>
+          <w:tcPr>
+            <w:tcW w:type="dxa" w:w="4819"/>
+            <w:tcBorders>
+              <w:top w:val="nil"/>
+              <w:left w:val="nil"/>
+              <w:bottom w:val="nil"/>
+              <w:right w:val="nil"/>
+              <w:insideH w:val="nil"/>
+              <w:insideV w:val="nil"/>
+            </w:tcBorders>
+          </w:tcPr>
+          <w:p>
+            <w:pPr>
+              <w:spacing w:after="40" w:before="0"/>
+            </w:pPr>
+            <w:r>
+              <w:rPr>
+                <w:rFonts w:ascii="Times New Roman" w:hAnsi="Times New Roman" w:eastAsia="宋体" w:cs="Times New Roman"/>
+                <w:b w:val="0"/>
+                <w:sz w:val="21"/>
+              </w:rPr>
+              <w:t>(2) 福瑞笛特别承担以下任务：</w:t>
+            </w:r>
+          </w:p>
+          <w:p>
+            <w:pPr>
+              <w:spacing w:after="40" w:before="0"/>
+            </w:pPr>
+            <w:r>
+              <w:rPr>
+                <w:rFonts w:ascii="Times New Roman" w:hAnsi="Times New Roman" w:eastAsia="宋体" w:cs="Times New Roman"/>
+                <w:b w:val="0"/>
+                <w:sz w:val="21"/>
+              </w:rPr>
+              <w:t>a) 中文地区的市场拓展与客户开发；</w:t>
+            </w:r>
+          </w:p>
+          <w:p>
+            <w:pPr>
+              <w:spacing w:after="40" w:before="0"/>
+            </w:pPr>
+            <w:r>
+              <w:rPr>
+                <w:rFonts w:ascii="Times New Roman" w:hAnsi="Times New Roman" w:eastAsia="宋体" w:cs="Times New Roman"/>
+                <w:b w:val="0"/>
+                <w:sz w:val="21"/>
+              </w:rPr>
+              <w:t>b) 客户维护、客户服务及与客户的日常沟通；</w:t>
+            </w:r>
+          </w:p>
+          <w:p>
+            <w:pPr>
+              <w:spacing w:after="40" w:before="0"/>
+            </w:pPr>
+            <w:r>
+              <w:rPr>
+                <w:rFonts w:ascii="Times New Roman" w:hAnsi="Times New Roman" w:eastAsia="宋体" w:cs="Times New Roman"/>
+                <w:b w:val="0"/>
+                <w:sz w:val="21"/>
+              </w:rPr>
+              <w:t>c) 在线门户的运营与维护，以及合同与支付处理；</w:t>
+            </w:r>
+          </w:p>
+          <w:p>
+            <w:pPr>
+              <w:spacing w:after="40" w:before="0"/>
+            </w:pPr>
+            <w:r>
+              <w:rPr>
+                <w:rFonts w:ascii="Times New Roman" w:hAnsi="Times New Roman" w:eastAsia="宋体" w:cs="Times New Roman"/>
+                <w:b w:val="0"/>
+                <w:sz w:val="21"/>
+              </w:rPr>
+              <w:t>d) 代收客户应付的全部款项，并按第4条转付。</w:t>
             </w:r>
           </w:p>
         </w:tc>
@@ -2273,7 +2273,7 @@
                 <w:b/>
                 <w:sz w:val="21"/>
               </w:rPr>
-              <w:t>§ 6  Pflichten des FREDDY</w:t>
+              <w:t>§ 6  Pflichten der LIVANTO</w:t>
             </w:r>
           </w:p>
         </w:tc>
@@ -2305,7 +2305,7 @@
                 <w:b/>
                 <w:sz w:val="21"/>
               </w:rPr>
-              <w:t>§ 6  福瑞笛的义务</w:t>
+              <w:t>§ 6  LIVANTO 的义务</w:t>
             </w:r>
           </w:p>
         </w:tc>
@@ -2345,7 +2345,7 @@
                 <w:b w:val="0"/>
                 <w:sz w:val="21"/>
               </w:rPr>
-              <w:t>(1) FREDDY erbringt die in § 3 Absatz 1 genannten Leistungen mit der Sorgfalt eines ordentlichen Kaufmanns.</w:t>
+              <w:t>(1) LIVANTO erbringt die in § 3 Absatz 1 genannten Leistungen fachgerecht und im Einklang mit dem jeweils geltenden Verpackungsrecht.</w:t>
             </w:r>
           </w:p>
         </w:tc>
@@ -2371,7 +2371,264 @@
                 <w:b w:val="0"/>
                 <w:sz w:val="21"/>
               </w:rPr>
-              <w:t>(1) 福瑞笛以诚实商人的审慎履行第3条第1款所述服务。</w:t>
+              <w:t>(1) LIVANTO 专业、合规地履行第3条第1款所述服务，并符合现行包装法规定。</w:t>
+            </w:r>
+          </w:p>
+        </w:tc>
+      </w:tr>
+      <w:tr>
+        <w:tc>
+          <w:tcPr>
+            <w:tcW w:type="dxa" w:w="4819"/>
+            <w:tcBorders>
+              <w:top w:val="nil"/>
+              <w:left w:val="nil"/>
+              <w:bottom w:val="nil"/>
+              <w:right w:val="nil"/>
+              <w:insideH w:val="nil"/>
+              <w:insideV w:val="nil"/>
+            </w:tcBorders>
+          </w:tcPr>
+          <w:p>
+            <w:pPr>
+              <w:spacing w:after="40" w:before="0"/>
+            </w:pPr>
+            <w:r>
+              <w:rPr>
+                <w:rFonts w:ascii="Times New Roman" w:hAnsi="Times New Roman" w:eastAsia="宋体" w:cs="Times New Roman"/>
+                <w:b w:val="0"/>
+                <w:sz w:val="21"/>
+              </w:rPr>
+              <w:t>(2) LIVANTO hält ihre Registrierung als Bevollmächtigter im Verpackungsregister LUCID während der gesamten Laufzeit aufrecht.</w:t>
+            </w:r>
+          </w:p>
+        </w:tc>
+        <w:tc>
+          <w:tcPr>
+            <w:tcW w:type="dxa" w:w="4819"/>
+            <w:tcBorders>
+              <w:top w:val="nil"/>
+              <w:left w:val="nil"/>
+              <w:bottom w:val="nil"/>
+              <w:right w:val="nil"/>
+              <w:insideH w:val="nil"/>
+              <w:insideV w:val="nil"/>
+            </w:tcBorders>
+          </w:tcPr>
+          <w:p>
+            <w:pPr>
+              <w:spacing w:after="40" w:before="0"/>
+            </w:pPr>
+            <w:r>
+              <w:rPr>
+                <w:rFonts w:ascii="Times New Roman" w:hAnsi="Times New Roman" w:eastAsia="宋体" w:cs="Times New Roman"/>
+                <w:b w:val="0"/>
+                <w:sz w:val="21"/>
+              </w:rPr>
+              <w:t>(2) LIVANTO 在整个合同期内维持其在包装品登记处 LUCID 的授权代表注册。</w:t>
+            </w:r>
+          </w:p>
+        </w:tc>
+      </w:tr>
+      <w:tr>
+        <w:tc>
+          <w:tcPr>
+            <w:tcW w:type="dxa" w:w="4819"/>
+            <w:tcBorders>
+              <w:top w:val="nil"/>
+              <w:left w:val="nil"/>
+              <w:bottom w:val="nil"/>
+              <w:right w:val="nil"/>
+              <w:insideH w:val="nil"/>
+              <w:insideV w:val="nil"/>
+            </w:tcBorders>
+          </w:tcPr>
+          <w:p>
+            <w:pPr>
+              <w:spacing w:after="40" w:before="0"/>
+            </w:pPr>
+            <w:r>
+              <w:rPr>
+                <w:rFonts w:ascii="Times New Roman" w:hAnsi="Times New Roman" w:eastAsia="宋体" w:cs="Times New Roman"/>
+                <w:b w:val="0"/>
+                <w:sz w:val="21"/>
+              </w:rPr>
+              <w:t>(3) LIVANTO informiert FREDDY über wesentliche Änderungen der gesetzlichen Rahmenbedingungen, die die Kunden betreffen.</w:t>
+            </w:r>
+          </w:p>
+        </w:tc>
+        <w:tc>
+          <w:tcPr>
+            <w:tcW w:type="dxa" w:w="4819"/>
+            <w:tcBorders>
+              <w:top w:val="nil"/>
+              <w:left w:val="nil"/>
+              <w:bottom w:val="nil"/>
+              <w:right w:val="nil"/>
+              <w:insideH w:val="nil"/>
+              <w:insideV w:val="nil"/>
+            </w:tcBorders>
+          </w:tcPr>
+          <w:p>
+            <w:pPr>
+              <w:spacing w:after="40" w:before="0"/>
+            </w:pPr>
+            <w:r>
+              <w:rPr>
+                <w:rFonts w:ascii="Times New Roman" w:hAnsi="Times New Roman" w:eastAsia="宋体" w:cs="Times New Roman"/>
+                <w:b w:val="0"/>
+                <w:sz w:val="21"/>
+              </w:rPr>
+              <w:t>(3) LIVANTO 就涉及客户的重大法律框架变更通知福瑞笛。</w:t>
+            </w:r>
+          </w:p>
+        </w:tc>
+      </w:tr>
+    </w:tbl>
+    <w:p>
+      <w:pPr>
+        <w:spacing w:after="40"/>
+      </w:pPr>
+    </w:p>
+    <w:tbl>
+      <w:tblPr>
+        <w:tblW w:type="dxa" w:w="97058"/>
+        <w:jc w:val="center"/>
+        <w:tblLayout w:type="fixed"/>
+        <w:tblLook w:firstColumn="1" w:firstRow="1" w:lastColumn="0" w:lastRow="0" w:noHBand="0" w:noVBand="1" w:val="04A0"/>
+      </w:tblPr>
+      <w:tblGrid>
+        <w:gridCol w:w="4853"/>
+        <w:gridCol w:w="4853"/>
+      </w:tblGrid>
+      <w:tr>
+        <w:tc>
+          <w:tcPr>
+            <w:tcW w:type="dxa" w:w="4819"/>
+            <w:tcBorders>
+              <w:top w:val="nil"/>
+              <w:left w:val="nil"/>
+              <w:bottom w:val="nil"/>
+              <w:right w:val="nil"/>
+              <w:insideH w:val="nil"/>
+              <w:insideV w:val="nil"/>
+              <w:top w:val="nil"/>
+              <w:left w:val="nil"/>
+              <w:right w:val="nil"/>
+              <w:insideH w:val="nil"/>
+              <w:insideV w:val="nil"/>
+              <w:bottom w:val="single" w:sz="4" w:color="999999"/>
+            </w:tcBorders>
+          </w:tcPr>
+          <w:p>
+            <w:pPr>
+              <w:spacing w:after="40" w:before="0"/>
+            </w:pPr>
+            <w:r>
+              <w:rPr>
+                <w:rFonts w:ascii="Times New Roman" w:hAnsi="Times New Roman" w:eastAsia="宋体" w:cs="Times New Roman"/>
+                <w:b/>
+                <w:sz w:val="21"/>
+              </w:rPr>
+              <w:t>§ 7  Pflichten des FREDDY</w:t>
+            </w:r>
+          </w:p>
+        </w:tc>
+        <w:tc>
+          <w:tcPr>
+            <w:tcW w:type="dxa" w:w="4819"/>
+            <w:tcBorders>
+              <w:top w:val="nil"/>
+              <w:left w:val="nil"/>
+              <w:bottom w:val="nil"/>
+              <w:right w:val="nil"/>
+              <w:insideH w:val="nil"/>
+              <w:insideV w:val="nil"/>
+              <w:top w:val="nil"/>
+              <w:left w:val="nil"/>
+              <w:right w:val="nil"/>
+              <w:insideH w:val="nil"/>
+              <w:insideV w:val="nil"/>
+              <w:bottom w:val="single" w:sz="4" w:color="999999"/>
+            </w:tcBorders>
+          </w:tcPr>
+          <w:p>
+            <w:pPr>
+              <w:spacing w:after="40" w:before="0"/>
+            </w:pPr>
+            <w:r>
+              <w:rPr>
+                <w:rFonts w:ascii="Times New Roman" w:hAnsi="Times New Roman" w:eastAsia="宋体" w:cs="Times New Roman"/>
+                <w:b/>
+                <w:sz w:val="21"/>
+              </w:rPr>
+              <w:t>§ 7  福瑞笛的义务</w:t>
+            </w:r>
+          </w:p>
+        </w:tc>
+      </w:tr>
+    </w:tbl>
+    <w:tbl>
+      <w:tblPr>
+        <w:tblW w:type="dxa" w:w="97058"/>
+        <w:jc w:val="center"/>
+        <w:tblLayout w:type="fixed"/>
+        <w:tblLook w:firstColumn="1" w:firstRow="1" w:lastColumn="0" w:lastRow="0" w:noHBand="0" w:noVBand="1" w:val="04A0"/>
+      </w:tblPr>
+      <w:tblGrid>
+        <w:gridCol w:w="4853"/>
+        <w:gridCol w:w="4853"/>
+      </w:tblGrid>
+      <w:tr>
+        <w:tc>
+          <w:tcPr>
+            <w:tcW w:type="dxa" w:w="4819"/>
+            <w:tcBorders>
+              <w:top w:val="nil"/>
+              <w:left w:val="nil"/>
+              <w:bottom w:val="nil"/>
+              <w:right w:val="nil"/>
+              <w:insideH w:val="nil"/>
+              <w:insideV w:val="nil"/>
+            </w:tcBorders>
+          </w:tcPr>
+          <w:p>
+            <w:pPr>
+              <w:spacing w:after="40" w:before="0"/>
+            </w:pPr>
+            <w:r>
+              <w:rPr>
+                <w:rFonts w:ascii="Times New Roman" w:hAnsi="Times New Roman" w:eastAsia="宋体" w:cs="Times New Roman"/>
+                <w:b w:val="0"/>
+                <w:sz w:val="21"/>
+              </w:rPr>
+              <w:t>(1) FREDDY erbringt die in § 3 Absatz 2 genannten Leistungen mit der Sorgfalt eines ordentlichen Kaufmanns.</w:t>
+            </w:r>
+          </w:p>
+        </w:tc>
+        <w:tc>
+          <w:tcPr>
+            <w:tcW w:type="dxa" w:w="4819"/>
+            <w:tcBorders>
+              <w:top w:val="nil"/>
+              <w:left w:val="nil"/>
+              <w:bottom w:val="nil"/>
+              <w:right w:val="nil"/>
+              <w:insideH w:val="nil"/>
+              <w:insideV w:val="nil"/>
+            </w:tcBorders>
+          </w:tcPr>
+          <w:p>
+            <w:pPr>
+              <w:spacing w:after="40" w:before="0"/>
+            </w:pPr>
+            <w:r>
+              <w:rPr>
+                <w:rFonts w:ascii="Times New Roman" w:hAnsi="Times New Roman" w:eastAsia="宋体" w:cs="Times New Roman"/>
+                <w:b w:val="0"/>
+                <w:sz w:val="21"/>
+              </w:rPr>
+              <w:t>(1) 福瑞笛以诚实商人的审慎履行第3条第2款所述服务。</w:t>
             </w:r>
           </w:p>
         </w:tc>
@@ -2480,263 +2737,6 @@
                 <w:sz w:val="21"/>
               </w:rPr>
               <w:t>(3) 福瑞笛应立即将影响授权的重要客户信息及客户变动情况告知 LIVANTO。</w:t>
-            </w:r>
-          </w:p>
-        </w:tc>
-      </w:tr>
-    </w:tbl>
-    <w:p>
-      <w:pPr>
-        <w:spacing w:after="40"/>
-      </w:pPr>
-    </w:p>
-    <w:tbl>
-      <w:tblPr>
-        <w:tblW w:type="dxa" w:w="97058"/>
-        <w:jc w:val="center"/>
-        <w:tblLayout w:type="fixed"/>
-        <w:tblLook w:firstColumn="1" w:firstRow="1" w:lastColumn="0" w:lastRow="0" w:noHBand="0" w:noVBand="1" w:val="04A0"/>
-      </w:tblPr>
-      <w:tblGrid>
-        <w:gridCol w:w="4853"/>
-        <w:gridCol w:w="4853"/>
-      </w:tblGrid>
-      <w:tr>
-        <w:tc>
-          <w:tcPr>
-            <w:tcW w:type="dxa" w:w="4819"/>
-            <w:tcBorders>
-              <w:top w:val="nil"/>
-              <w:left w:val="nil"/>
-              <w:bottom w:val="nil"/>
-              <w:right w:val="nil"/>
-              <w:insideH w:val="nil"/>
-              <w:insideV w:val="nil"/>
-              <w:top w:val="nil"/>
-              <w:left w:val="nil"/>
-              <w:right w:val="nil"/>
-              <w:insideH w:val="nil"/>
-              <w:insideV w:val="nil"/>
-              <w:bottom w:val="single" w:sz="4" w:color="999999"/>
-            </w:tcBorders>
-          </w:tcPr>
-          <w:p>
-            <w:pPr>
-              <w:spacing w:after="40" w:before="0"/>
-            </w:pPr>
-            <w:r>
-              <w:rPr>
-                <w:rFonts w:ascii="Times New Roman" w:hAnsi="Times New Roman" w:eastAsia="宋体" w:cs="Times New Roman"/>
-                <w:b/>
-                <w:sz w:val="21"/>
-              </w:rPr>
-              <w:t>§ 7  Pflichten der LIVANTO</w:t>
-            </w:r>
-          </w:p>
-        </w:tc>
-        <w:tc>
-          <w:tcPr>
-            <w:tcW w:type="dxa" w:w="4819"/>
-            <w:tcBorders>
-              <w:top w:val="nil"/>
-              <w:left w:val="nil"/>
-              <w:bottom w:val="nil"/>
-              <w:right w:val="nil"/>
-              <w:insideH w:val="nil"/>
-              <w:insideV w:val="nil"/>
-              <w:top w:val="nil"/>
-              <w:left w:val="nil"/>
-              <w:right w:val="nil"/>
-              <w:insideH w:val="nil"/>
-              <w:insideV w:val="nil"/>
-              <w:bottom w:val="single" w:sz="4" w:color="999999"/>
-            </w:tcBorders>
-          </w:tcPr>
-          <w:p>
-            <w:pPr>
-              <w:spacing w:after="40" w:before="0"/>
-            </w:pPr>
-            <w:r>
-              <w:rPr>
-                <w:rFonts w:ascii="Times New Roman" w:hAnsi="Times New Roman" w:eastAsia="宋体" w:cs="Times New Roman"/>
-                <w:b/>
-                <w:sz w:val="21"/>
-              </w:rPr>
-              <w:t>§ 7  LIVANTO 的义务</w:t>
-            </w:r>
-          </w:p>
-        </w:tc>
-      </w:tr>
-    </w:tbl>
-    <w:tbl>
-      <w:tblPr>
-        <w:tblW w:type="dxa" w:w="97058"/>
-        <w:jc w:val="center"/>
-        <w:tblLayout w:type="fixed"/>
-        <w:tblLook w:firstColumn="1" w:firstRow="1" w:lastColumn="0" w:lastRow="0" w:noHBand="0" w:noVBand="1" w:val="04A0"/>
-      </w:tblPr>
-      <w:tblGrid>
-        <w:gridCol w:w="4853"/>
-        <w:gridCol w:w="4853"/>
-      </w:tblGrid>
-      <w:tr>
-        <w:tc>
-          <w:tcPr>
-            <w:tcW w:type="dxa" w:w="4819"/>
-            <w:tcBorders>
-              <w:top w:val="nil"/>
-              <w:left w:val="nil"/>
-              <w:bottom w:val="nil"/>
-              <w:right w:val="nil"/>
-              <w:insideH w:val="nil"/>
-              <w:insideV w:val="nil"/>
-            </w:tcBorders>
-          </w:tcPr>
-          <w:p>
-            <w:pPr>
-              <w:spacing w:after="40" w:before="0"/>
-            </w:pPr>
-            <w:r>
-              <w:rPr>
-                <w:rFonts w:ascii="Times New Roman" w:hAnsi="Times New Roman" w:eastAsia="宋体" w:cs="Times New Roman"/>
-                <w:b w:val="0"/>
-                <w:sz w:val="21"/>
-              </w:rPr>
-              <w:t>(1) LIVANTO erbringt die in § 3 Absatz 2 genannten Leistungen fachgerecht und im Einklang mit dem jeweils geltenden Verpackungsrecht.</w:t>
-            </w:r>
-          </w:p>
-        </w:tc>
-        <w:tc>
-          <w:tcPr>
-            <w:tcW w:type="dxa" w:w="4819"/>
-            <w:tcBorders>
-              <w:top w:val="nil"/>
-              <w:left w:val="nil"/>
-              <w:bottom w:val="nil"/>
-              <w:right w:val="nil"/>
-              <w:insideH w:val="nil"/>
-              <w:insideV w:val="nil"/>
-            </w:tcBorders>
-          </w:tcPr>
-          <w:p>
-            <w:pPr>
-              <w:spacing w:after="40" w:before="0"/>
-            </w:pPr>
-            <w:r>
-              <w:rPr>
-                <w:rFonts w:ascii="Times New Roman" w:hAnsi="Times New Roman" w:eastAsia="宋体" w:cs="Times New Roman"/>
-                <w:b w:val="0"/>
-                <w:sz w:val="21"/>
-              </w:rPr>
-              <w:t>(1) LIVANTO 专业、合规地履行第3条第2款所述服务，并符合现行包装法规定。</w:t>
-            </w:r>
-          </w:p>
-        </w:tc>
-      </w:tr>
-      <w:tr>
-        <w:tc>
-          <w:tcPr>
-            <w:tcW w:type="dxa" w:w="4819"/>
-            <w:tcBorders>
-              <w:top w:val="nil"/>
-              <w:left w:val="nil"/>
-              <w:bottom w:val="nil"/>
-              <w:right w:val="nil"/>
-              <w:insideH w:val="nil"/>
-              <w:insideV w:val="nil"/>
-            </w:tcBorders>
-          </w:tcPr>
-          <w:p>
-            <w:pPr>
-              <w:spacing w:after="40" w:before="0"/>
-            </w:pPr>
-            <w:r>
-              <w:rPr>
-                <w:rFonts w:ascii="Times New Roman" w:hAnsi="Times New Roman" w:eastAsia="宋体" w:cs="Times New Roman"/>
-                <w:b w:val="0"/>
-                <w:sz w:val="21"/>
-              </w:rPr>
-              <w:t>(2) LIVANTO hält ihre Registrierung als Bevollmächtigter im Verpackungsregister LUCID während der gesamten Laufzeit aufrecht.</w:t>
-            </w:r>
-          </w:p>
-        </w:tc>
-        <w:tc>
-          <w:tcPr>
-            <w:tcW w:type="dxa" w:w="4819"/>
-            <w:tcBorders>
-              <w:top w:val="nil"/>
-              <w:left w:val="nil"/>
-              <w:bottom w:val="nil"/>
-              <w:right w:val="nil"/>
-              <w:insideH w:val="nil"/>
-              <w:insideV w:val="nil"/>
-            </w:tcBorders>
-          </w:tcPr>
-          <w:p>
-            <w:pPr>
-              <w:spacing w:after="40" w:before="0"/>
-            </w:pPr>
-            <w:r>
-              <w:rPr>
-                <w:rFonts w:ascii="Times New Roman" w:hAnsi="Times New Roman" w:eastAsia="宋体" w:cs="Times New Roman"/>
-                <w:b w:val="0"/>
-                <w:sz w:val="21"/>
-              </w:rPr>
-              <w:t>(2) LIVANTO 在整个合同期内维持其在包装品登记处 LUCID 的授权代表注册。</w:t>
-            </w:r>
-          </w:p>
-        </w:tc>
-      </w:tr>
-      <w:tr>
-        <w:tc>
-          <w:tcPr>
-            <w:tcW w:type="dxa" w:w="4819"/>
-            <w:tcBorders>
-              <w:top w:val="nil"/>
-              <w:left w:val="nil"/>
-              <w:bottom w:val="nil"/>
-              <w:right w:val="nil"/>
-              <w:insideH w:val="nil"/>
-              <w:insideV w:val="nil"/>
-            </w:tcBorders>
-          </w:tcPr>
-          <w:p>
-            <w:pPr>
-              <w:spacing w:after="40" w:before="0"/>
-            </w:pPr>
-            <w:r>
-              <w:rPr>
-                <w:rFonts w:ascii="Times New Roman" w:hAnsi="Times New Roman" w:eastAsia="宋体" w:cs="Times New Roman"/>
-                <w:b w:val="0"/>
-                <w:sz w:val="21"/>
-              </w:rPr>
-              <w:t>(3) LIVANTO informiert FREDDY über wesentliche Änderungen der gesetzlichen Rahmenbedingungen, die die Kunden betreffen.</w:t>
-            </w:r>
-          </w:p>
-        </w:tc>
-        <w:tc>
-          <w:tcPr>
-            <w:tcW w:type="dxa" w:w="4819"/>
-            <w:tcBorders>
-              <w:top w:val="nil"/>
-              <w:left w:val="nil"/>
-              <w:bottom w:val="nil"/>
-              <w:right w:val="nil"/>
-              <w:insideH w:val="nil"/>
-              <w:insideV w:val="nil"/>
-            </w:tcBorders>
-          </w:tcPr>
-          <w:p>
-            <w:pPr>
-              <w:spacing w:after="40" w:before="0"/>
-            </w:pPr>
-            <w:r>
-              <w:rPr>
-                <w:rFonts w:ascii="Times New Roman" w:hAnsi="Times New Roman" w:eastAsia="宋体" w:cs="Times New Roman"/>
-                <w:b w:val="0"/>
-                <w:sz w:val="21"/>
-              </w:rPr>
-              <w:t>(3) LIVANTO 就涉及客户的重大法律框架变更通知福瑞笛。</w:t>
             </w:r>
           </w:p>
         </w:tc>
@@ -4497,173 +4497,6 @@
                 <w:b w:val="0"/>
                 <w:sz w:val="21"/>
               </w:rPr>
-              <w:t>FREDDY (SHANGHAI) INFORMATION CONSULTING LTD.</w:t>
-            </w:r>
-          </w:p>
-          <w:p>
-            <w:pPr>
-              <w:spacing w:after="40" w:before="0"/>
-            </w:pPr>
-            <w:r>
-              <w:rPr>
-                <w:rFonts w:ascii="Times New Roman" w:hAnsi="Times New Roman" w:eastAsia="宋体" w:cs="Times New Roman"/>
-                <w:b w:val="0"/>
-                <w:sz w:val="21"/>
-              </w:rPr>
-              <w:t>Zweigniederlassung Huainan</w:t>
-            </w:r>
-          </w:p>
-          <w:p>
-            <w:pPr>
-              <w:spacing w:after="40" w:before="0"/>
-            </w:pPr>
-            <w:r>
-              <w:rPr>
-                <w:rFonts w:ascii="Times New Roman" w:hAnsi="Times New Roman" w:eastAsia="宋体" w:cs="Times New Roman"/>
-                <w:b w:val="0"/>
-                <w:sz w:val="21"/>
-              </w:rPr>
-            </w:r>
-          </w:p>
-          <w:p>
-            <w:pPr>
-              <w:spacing w:after="40" w:before="0"/>
-            </w:pPr>
-            <w:r>
-              <w:rPr>
-                <w:rFonts w:ascii="Times New Roman" w:hAnsi="Times New Roman" w:eastAsia="宋体" w:cs="Times New Roman"/>
-                <w:b w:val="0"/>
-                <w:sz w:val="21"/>
-              </w:rPr>
-              <w:t>Ort / Datum: ____________________</w:t>
-            </w:r>
-          </w:p>
-          <w:p>
-            <w:pPr>
-              <w:spacing w:after="40" w:before="0"/>
-            </w:pPr>
-            <w:r>
-              <w:rPr>
-                <w:rFonts w:ascii="Times New Roman" w:hAnsi="Times New Roman" w:eastAsia="宋体" w:cs="Times New Roman"/>
-                <w:b w:val="0"/>
-                <w:sz w:val="21"/>
-              </w:rPr>
-            </w:r>
-          </w:p>
-          <w:p>
-            <w:pPr>
-              <w:spacing w:after="40" w:before="0"/>
-            </w:pPr>
-            <w:r>
-              <w:rPr>
-                <w:rFonts w:ascii="Times New Roman" w:hAnsi="Times New Roman" w:eastAsia="宋体" w:cs="Times New Roman"/>
-                <w:b w:val="0"/>
-                <w:sz w:val="21"/>
-              </w:rPr>
-              <w:t>Unterschrift / Stempel:</w:t>
-            </w:r>
-          </w:p>
-        </w:tc>
-        <w:tc>
-          <w:tcPr>
-            <w:tcW w:type="dxa" w:w="4819"/>
-            <w:tcBorders>
-              <w:top w:val="nil"/>
-              <w:left w:val="nil"/>
-              <w:bottom w:val="nil"/>
-              <w:right w:val="nil"/>
-              <w:insideH w:val="nil"/>
-              <w:insideV w:val="nil"/>
-            </w:tcBorders>
-          </w:tcPr>
-          <w:p>
-            <w:pPr>
-              <w:spacing w:after="40" w:before="0"/>
-            </w:pPr>
-            <w:r>
-              <w:rPr>
-                <w:rFonts w:ascii="Times New Roman" w:hAnsi="Times New Roman" w:eastAsia="宋体" w:cs="Times New Roman"/>
-                <w:b w:val="0"/>
-                <w:sz w:val="21"/>
-              </w:rPr>
-              <w:t>福瑞笛（上海）信息咨询有限公司淮南分公司</w:t>
-            </w:r>
-          </w:p>
-          <w:p>
-            <w:pPr>
-              <w:spacing w:after="40" w:before="0"/>
-            </w:pPr>
-            <w:r>
-              <w:rPr>
-                <w:rFonts w:ascii="Times New Roman" w:hAnsi="Times New Roman" w:eastAsia="宋体" w:cs="Times New Roman"/>
-                <w:b w:val="0"/>
-                <w:sz w:val="21"/>
-              </w:rPr>
-            </w:r>
-          </w:p>
-          <w:p>
-            <w:pPr>
-              <w:spacing w:after="40" w:before="0"/>
-            </w:pPr>
-            <w:r>
-              <w:rPr>
-                <w:rFonts w:ascii="Times New Roman" w:hAnsi="Times New Roman" w:eastAsia="宋体" w:cs="Times New Roman"/>
-                <w:b w:val="0"/>
-                <w:sz w:val="21"/>
-              </w:rPr>
-              <w:t>地点 / 日期：____________________</w:t>
-            </w:r>
-          </w:p>
-          <w:p>
-            <w:pPr>
-              <w:spacing w:after="40" w:before="0"/>
-            </w:pPr>
-            <w:r>
-              <w:rPr>
-                <w:rFonts w:ascii="Times New Roman" w:hAnsi="Times New Roman" w:eastAsia="宋体" w:cs="Times New Roman"/>
-                <w:b w:val="0"/>
-                <w:sz w:val="21"/>
-              </w:rPr>
-            </w:r>
-          </w:p>
-          <w:p>
-            <w:pPr>
-              <w:spacing w:after="40" w:before="0"/>
-            </w:pPr>
-            <w:r>
-              <w:rPr>
-                <w:rFonts w:ascii="Times New Roman" w:hAnsi="Times New Roman" w:eastAsia="宋体" w:cs="Times New Roman"/>
-                <w:b w:val="0"/>
-                <w:sz w:val="21"/>
-              </w:rPr>
-              <w:t>签字 / 盖章：</w:t>
-            </w:r>
-          </w:p>
-        </w:tc>
-      </w:tr>
-      <w:tr>
-        <w:tc>
-          <w:tcPr>
-            <w:tcW w:type="dxa" w:w="4819"/>
-            <w:tcBorders>
-              <w:top w:val="nil"/>
-              <w:left w:val="nil"/>
-              <w:bottom w:val="nil"/>
-              <w:right w:val="nil"/>
-              <w:insideH w:val="nil"/>
-              <w:insideV w:val="nil"/>
-            </w:tcBorders>
-          </w:tcPr>
-          <w:p>
-            <w:pPr>
-              <w:spacing w:after="40" w:before="0"/>
-            </w:pPr>
-            <w:r>
-              <w:rPr>
-                <w:rFonts w:ascii="Times New Roman" w:hAnsi="Times New Roman" w:eastAsia="宋体" w:cs="Times New Roman"/>
-                <w:b w:val="0"/>
-                <w:sz w:val="21"/>
-              </w:rPr>
               <w:t>LIVANTO GmbH</w:t>
             </w:r>
           </w:p>
@@ -4767,6 +4600,186 @@
                 <w:sz w:val="21"/>
               </w:rPr>
               <w:t>多特蒙德</w:t>
+            </w:r>
+          </w:p>
+          <w:p>
+            <w:pPr>
+              <w:spacing w:after="40" w:before="0"/>
+            </w:pPr>
+            <w:r>
+              <w:rPr>
+                <w:rFonts w:ascii="Times New Roman" w:hAnsi="Times New Roman" w:eastAsia="宋体" w:cs="Times New Roman"/>
+                <w:b w:val="0"/>
+                <w:sz w:val="21"/>
+              </w:rPr>
+            </w:r>
+          </w:p>
+          <w:p>
+            <w:pPr>
+              <w:spacing w:after="40" w:before="0"/>
+            </w:pPr>
+            <w:r>
+              <w:rPr>
+                <w:rFonts w:ascii="Times New Roman" w:hAnsi="Times New Roman" w:eastAsia="宋体" w:cs="Times New Roman"/>
+                <w:b w:val="0"/>
+                <w:sz w:val="21"/>
+              </w:rPr>
+              <w:t>地点 / 日期：____________________</w:t>
+            </w:r>
+          </w:p>
+          <w:p>
+            <w:pPr>
+              <w:spacing w:after="40" w:before="0"/>
+            </w:pPr>
+            <w:r>
+              <w:rPr>
+                <w:rFonts w:ascii="Times New Roman" w:hAnsi="Times New Roman" w:eastAsia="宋体" w:cs="Times New Roman"/>
+                <w:b w:val="0"/>
+                <w:sz w:val="21"/>
+              </w:rPr>
+            </w:r>
+          </w:p>
+          <w:p>
+            <w:pPr>
+              <w:spacing w:after="40" w:before="0"/>
+            </w:pPr>
+            <w:r>
+              <w:rPr>
+                <w:rFonts w:ascii="Times New Roman" w:hAnsi="Times New Roman" w:eastAsia="宋体" w:cs="Times New Roman"/>
+                <w:b w:val="0"/>
+                <w:sz w:val="21"/>
+              </w:rPr>
+              <w:t>签字 / 盖章：</w:t>
+            </w:r>
+          </w:p>
+        </w:tc>
+      </w:tr>
+      <w:tr>
+        <w:tc>
+          <w:tcPr>
+            <w:tcW w:type="dxa" w:w="4819"/>
+            <w:tcBorders>
+              <w:top w:val="nil"/>
+              <w:left w:val="nil"/>
+              <w:bottom w:val="nil"/>
+              <w:right w:val="nil"/>
+              <w:insideH w:val="nil"/>
+              <w:insideV w:val="nil"/>
+            </w:tcBorders>
+          </w:tcPr>
+          <w:p>
+            <w:pPr>
+              <w:spacing w:after="40" w:before="0"/>
+            </w:pPr>
+            <w:r>
+              <w:rPr>
+                <w:rFonts w:ascii="Times New Roman" w:hAnsi="Times New Roman" w:eastAsia="宋体" w:cs="Times New Roman"/>
+                <w:b w:val="0"/>
+                <w:sz w:val="21"/>
+              </w:rPr>
+              <w:t>FREDDY (SHANGHAI) INFORMATION CONSULTING LTD. HN</w:t>
+            </w:r>
+          </w:p>
+          <w:p>
+            <w:pPr>
+              <w:spacing w:after="40" w:before="0"/>
+            </w:pPr>
+            <w:r>
+              <w:rPr>
+                <w:rFonts w:ascii="Times New Roman" w:hAnsi="Times New Roman" w:eastAsia="宋体" w:cs="Times New Roman"/>
+                <w:b w:val="0"/>
+                <w:sz w:val="21"/>
+              </w:rPr>
+              <w:t>Zweigniederlassung Huainan</w:t>
+            </w:r>
+          </w:p>
+          <w:p>
+            <w:pPr>
+              <w:spacing w:after="40" w:before="0"/>
+            </w:pPr>
+            <w:r>
+              <w:rPr>
+                <w:rFonts w:ascii="Times New Roman" w:hAnsi="Times New Roman" w:eastAsia="宋体" w:cs="Times New Roman"/>
+                <w:b w:val="0"/>
+                <w:sz w:val="21"/>
+              </w:rPr>
+            </w:r>
+          </w:p>
+          <w:p>
+            <w:pPr>
+              <w:spacing w:after="40" w:before="0"/>
+            </w:pPr>
+            <w:r>
+              <w:rPr>
+                <w:rFonts w:ascii="Times New Roman" w:hAnsi="Times New Roman" w:eastAsia="宋体" w:cs="Times New Roman"/>
+                <w:b w:val="0"/>
+                <w:sz w:val="21"/>
+              </w:rPr>
+              <w:t>Ort / Datum: ____________________</w:t>
+            </w:r>
+          </w:p>
+          <w:p>
+            <w:pPr>
+              <w:spacing w:after="40" w:before="0"/>
+            </w:pPr>
+            <w:r>
+              <w:rPr>
+                <w:rFonts w:ascii="Times New Roman" w:hAnsi="Times New Roman" w:eastAsia="宋体" w:cs="Times New Roman"/>
+                <w:b w:val="0"/>
+                <w:sz w:val="21"/>
+              </w:rPr>
+            </w:r>
+          </w:p>
+          <w:p>
+            <w:pPr>
+              <w:spacing w:after="40" w:before="0"/>
+            </w:pPr>
+            <w:r>
+              <w:rPr>
+                <w:rFonts w:ascii="Times New Roman" w:hAnsi="Times New Roman" w:eastAsia="宋体" w:cs="Times New Roman"/>
+                <w:b w:val="0"/>
+                <w:sz w:val="21"/>
+              </w:rPr>
+              <w:t>Unterschrift / Stempel:</w:t>
+            </w:r>
+          </w:p>
+        </w:tc>
+        <w:tc>
+          <w:tcPr>
+            <w:tcW w:type="dxa" w:w="4819"/>
+            <w:tcBorders>
+              <w:top w:val="nil"/>
+              <w:left w:val="nil"/>
+              <w:bottom w:val="nil"/>
+              <w:right w:val="nil"/>
+              <w:insideH w:val="nil"/>
+              <w:insideV w:val="nil"/>
+            </w:tcBorders>
+          </w:tcPr>
+          <w:p>
+            <w:pPr>
+              <w:spacing w:after="40" w:before="0"/>
+            </w:pPr>
+            <w:r>
+              <w:rPr>
+                <w:rFonts w:ascii="Times New Roman" w:hAnsi="Times New Roman" w:eastAsia="宋体" w:cs="Times New Roman"/>
+                <w:b w:val="0"/>
+                <w:sz w:val="21"/>
+              </w:rPr>
+              <w:t>FREDDY (SHANGHAI) INFORMATION CONSULTING LTD. HN</w:t>
+            </w:r>
+          </w:p>
+          <w:p>
+            <w:pPr>
+              <w:spacing w:after="40" w:before="0"/>
+            </w:pPr>
+            <w:r>
+              <w:rPr>
+                <w:rFonts w:ascii="Times New Roman" w:hAnsi="Times New Roman" w:eastAsia="宋体" w:cs="Times New Roman"/>
+                <w:b w:val="0"/>
+                <w:sz w:val="21"/>
+              </w:rPr>
+              <w:t>（福瑞笛（上海）信息咨询有限公司淮南分公司）</w:t>
             </w:r>
           </w:p>
           <w:p>

</xml_diff>

<commit_message>
feat: 合作协议加附件D——SCC(EU 2021/914)Module 1（含Annex I/II+PIPL方向说明）
</commit_message>
<xml_diff>
--- a/projects/contracts/FREDDY-LIVANTO/Kooperationsvereinbarung_FREDDY-LIVANTO.docx
+++ b/projects/contracts/FREDDY-LIVANTO/Kooperationsvereinbarung_FREDDY-LIVANTO.docx
@@ -4431,6 +4431,590 @@
                 <w:b/>
                 <w:sz w:val="21"/>
               </w:rPr>
+              <w:t>Anlage D: EU-Standardvertragsklauseln (SCC) – Modul 1</w:t>
+            </w:r>
+          </w:p>
+        </w:tc>
+        <w:tc>
+          <w:tcPr>
+            <w:tcW w:type="dxa" w:w="4819"/>
+            <w:tcBorders>
+              <w:top w:val="nil"/>
+              <w:left w:val="nil"/>
+              <w:bottom w:val="nil"/>
+              <w:right w:val="nil"/>
+              <w:insideH w:val="nil"/>
+              <w:insideV w:val="nil"/>
+            </w:tcBorders>
+          </w:tcPr>
+          <w:p>
+            <w:pPr>
+              <w:spacing w:after="40" w:before="0"/>
+            </w:pPr>
+            <w:r>
+              <w:rPr>
+                <w:rFonts w:ascii="Times New Roman" w:hAnsi="Times New Roman" w:eastAsia="宋体" w:cs="Times New Roman"/>
+                <w:b/>
+                <w:sz w:val="21"/>
+              </w:rPr>
+              <w:t>附件 D：欧盟标准合同条款（SCC）— 模块 1</w:t>
+            </w:r>
+          </w:p>
+        </w:tc>
+      </w:tr>
+    </w:tbl>
+    <w:tbl>
+      <w:tblPr>
+        <w:tblW w:type="dxa" w:w="97058"/>
+        <w:jc w:val="center"/>
+        <w:tblLayout w:type="fixed"/>
+        <w:tblLook w:firstColumn="1" w:firstRow="1" w:lastColumn="0" w:lastRow="0" w:noHBand="0" w:noVBand="1" w:val="04A0"/>
+      </w:tblPr>
+      <w:tblGrid>
+        <w:gridCol w:w="4853"/>
+        <w:gridCol w:w="4853"/>
+      </w:tblGrid>
+      <w:tr>
+        <w:tc>
+          <w:tcPr>
+            <w:tcW w:type="dxa" w:w="4819"/>
+            <w:tcBorders>
+              <w:top w:val="nil"/>
+              <w:left w:val="nil"/>
+              <w:bottom w:val="nil"/>
+              <w:right w:val="nil"/>
+              <w:insideH w:val="nil"/>
+              <w:insideV w:val="nil"/>
+            </w:tcBorders>
+          </w:tcPr>
+          <w:p>
+            <w:pPr>
+              <w:spacing w:after="40" w:before="0"/>
+            </w:pPr>
+            <w:r>
+              <w:rPr>
+                <w:rFonts w:ascii="Times New Roman" w:hAnsi="Times New Roman" w:eastAsia="宋体" w:cs="Times New Roman"/>
+                <w:b w:val="0"/>
+                <w:sz w:val="21"/>
+              </w:rPr>
+              <w:t>(1) Die Parteien vereinbaren, dass für die Übermittlung personenbezogener Daten von LIVANTO an FREDDY in die Volksrepublik China die Standardvertragsklauseln gemäß Durchführungsbeschluss (EU) 2021/914 der Europäischen Kommission in der Fassung von Modul 1 (Übermittlung von Verantwortlichem an Verantwortlichen) Anwendung finden. Die Standardvertragsklauseln einschließlich ihrer Anhänge sind Bestandteil dieser Anlage.</w:t>
+            </w:r>
+          </w:p>
+        </w:tc>
+        <w:tc>
+          <w:tcPr>
+            <w:tcW w:type="dxa" w:w="4819"/>
+            <w:tcBorders>
+              <w:top w:val="nil"/>
+              <w:left w:val="nil"/>
+              <w:bottom w:val="nil"/>
+              <w:right w:val="nil"/>
+              <w:insideH w:val="nil"/>
+              <w:insideV w:val="nil"/>
+            </w:tcBorders>
+          </w:tcPr>
+          <w:p>
+            <w:pPr>
+              <w:spacing w:after="40" w:before="0"/>
+            </w:pPr>
+            <w:r>
+              <w:rPr>
+                <w:rFonts w:ascii="Times New Roman" w:hAnsi="Times New Roman" w:eastAsia="宋体" w:cs="Times New Roman"/>
+                <w:b w:val="0"/>
+                <w:sz w:val="21"/>
+              </w:rPr>
+              <w:t>(1) 双方约定，LIVANTO 向中华人民共和国境内的福瑞笛传输个人数据，适用欧盟委员会执行决定 (EU) 2021/914 项下标准合同条款的模块 1（控制者向控制者传输）。该标准合同条款及其附录为本附件的组成部分。</w:t>
+            </w:r>
+          </w:p>
+        </w:tc>
+      </w:tr>
+      <w:tr>
+        <w:tc>
+          <w:tcPr>
+            <w:tcW w:type="dxa" w:w="4819"/>
+            <w:tcBorders>
+              <w:top w:val="nil"/>
+              <w:left w:val="nil"/>
+              <w:bottom w:val="nil"/>
+              <w:right w:val="nil"/>
+              <w:insideH w:val="nil"/>
+              <w:insideV w:val="nil"/>
+            </w:tcBorders>
+          </w:tcPr>
+          <w:p>
+            <w:pPr>
+              <w:spacing w:after="40" w:before="0"/>
+            </w:pPr>
+            <w:r>
+              <w:rPr>
+                <w:rFonts w:ascii="Times New Roman" w:hAnsi="Times New Roman" w:eastAsia="宋体" w:cs="Times New Roman"/>
+                <w:b w:val="0"/>
+                <w:sz w:val="21"/>
+              </w:rPr>
+              <w:t>(2) Anhang I A. – Liste der Parteien:</w:t>
+            </w:r>
+          </w:p>
+          <w:p>
+            <w:pPr>
+              <w:spacing w:after="40" w:before="0"/>
+            </w:pPr>
+            <w:r>
+              <w:rPr>
+                <w:rFonts w:ascii="Times New Roman" w:hAnsi="Times New Roman" w:eastAsia="宋体" w:cs="Times New Roman"/>
+                <w:b w:val="0"/>
+                <w:sz w:val="21"/>
+              </w:rPr>
+              <w:t>Datenexporteur: LIVANTO GmbH, Luisenhoffnung 3C, 44225 Dortmund, Deutschland; Rolle: Verantwortlicher.</w:t>
+            </w:r>
+          </w:p>
+          <w:p>
+            <w:pPr>
+              <w:spacing w:after="40" w:before="0"/>
+            </w:pPr>
+            <w:r>
+              <w:rPr>
+                <w:rFonts w:ascii="Times New Roman" w:hAnsi="Times New Roman" w:eastAsia="宋体" w:cs="Times New Roman"/>
+                <w:b w:val="0"/>
+                <w:sz w:val="21"/>
+              </w:rPr>
+              <w:t>Datenimporteur: FREDDY (SHANGHAI) INFORMATION CONSULTING LTD. HN, Zhonghuan International Plaza, Finanzzentrum 158, 4. Etage, Raum 418, Huainan, Anhui, Volksrepublik China; Rolle: Verantwortlicher.</w:t>
+            </w:r>
+          </w:p>
+        </w:tc>
+        <w:tc>
+          <w:tcPr>
+            <w:tcW w:type="dxa" w:w="4819"/>
+            <w:tcBorders>
+              <w:top w:val="nil"/>
+              <w:left w:val="nil"/>
+              <w:bottom w:val="nil"/>
+              <w:right w:val="nil"/>
+              <w:insideH w:val="nil"/>
+              <w:insideV w:val="nil"/>
+            </w:tcBorders>
+          </w:tcPr>
+          <w:p>
+            <w:pPr>
+              <w:spacing w:after="40" w:before="0"/>
+            </w:pPr>
+            <w:r>
+              <w:rPr>
+                <w:rFonts w:ascii="Times New Roman" w:hAnsi="Times New Roman" w:eastAsia="宋体" w:cs="Times New Roman"/>
+                <w:b w:val="0"/>
+                <w:sz w:val="21"/>
+              </w:rPr>
+              <w:t>(2) 附录 I A. – 双方名单：</w:t>
+            </w:r>
+          </w:p>
+          <w:p>
+            <w:pPr>
+              <w:spacing w:after="40" w:before="0"/>
+            </w:pPr>
+            <w:r>
+              <w:rPr>
+                <w:rFonts w:ascii="Times New Roman" w:hAnsi="Times New Roman" w:eastAsia="宋体" w:cs="Times New Roman"/>
+                <w:b w:val="0"/>
+                <w:sz w:val="21"/>
+              </w:rPr>
+              <w:t>数据出口方：LIVANTO GmbH，德国多特蒙德 Luisenhoffnung 3C（邮编 44225）；角色：控制者。</w:t>
+            </w:r>
+          </w:p>
+          <w:p>
+            <w:pPr>
+              <w:spacing w:after="40" w:before="0"/>
+            </w:pPr>
+            <w:r>
+              <w:rPr>
+                <w:rFonts w:ascii="Times New Roman" w:hAnsi="Times New Roman" w:eastAsia="宋体" w:cs="Times New Roman"/>
+                <w:b w:val="0"/>
+                <w:sz w:val="21"/>
+              </w:rPr>
+              <w:t>数据进口方：FREDDY (SHANGHAI) INFORMATION CONSULTING LTD. HN，中华人民共和国安徽省淮南市中环国际广场158金融中心四层418室；角色：控制者。</w:t>
+            </w:r>
+          </w:p>
+        </w:tc>
+      </w:tr>
+      <w:tr>
+        <w:tc>
+          <w:tcPr>
+            <w:tcW w:type="dxa" w:w="4819"/>
+            <w:tcBorders>
+              <w:top w:val="nil"/>
+              <w:left w:val="nil"/>
+              <w:bottom w:val="nil"/>
+              <w:right w:val="nil"/>
+              <w:insideH w:val="nil"/>
+              <w:insideV w:val="nil"/>
+            </w:tcBorders>
+          </w:tcPr>
+          <w:p>
+            <w:pPr>
+              <w:spacing w:after="40" w:before="0"/>
+            </w:pPr>
+            <w:r>
+              <w:rPr>
+                <w:rFonts w:ascii="Times New Roman" w:hAnsi="Times New Roman" w:eastAsia="宋体" w:cs="Times New Roman"/>
+                <w:b w:val="0"/>
+                <w:sz w:val="21"/>
+              </w:rPr>
+              <w:t>(3) Anhang I B. – Beschreibung der Übermittlung:</w:t>
+            </w:r>
+          </w:p>
+          <w:p>
+            <w:pPr>
+              <w:spacing w:after="40" w:before="0"/>
+            </w:pPr>
+            <w:r>
+              <w:rPr>
+                <w:rFonts w:ascii="Times New Roman" w:hAnsi="Times New Roman" w:eastAsia="宋体" w:cs="Times New Roman"/>
+                <w:b w:val="0"/>
+                <w:sz w:val="21"/>
+              </w:rPr>
+              <w:t>Kategorien betroffener Personen: Kontaktpersonen und gesetzliche Vertreter der Kunden.</w:t>
+            </w:r>
+          </w:p>
+          <w:p>
+            <w:pPr>
+              <w:spacing w:after="40" w:before="0"/>
+            </w:pPr>
+            <w:r>
+              <w:rPr>
+                <w:rFonts w:ascii="Times New Roman" w:hAnsi="Times New Roman" w:eastAsia="宋体" w:cs="Times New Roman"/>
+                <w:b w:val="0"/>
+                <w:sz w:val="21"/>
+              </w:rPr>
+              <w:t>Kategorien personenbezogener Daten: Name, Firma, Anschrift, E-Mail-Adresse, Telefonnummer, WeChat-ID, Steuernummer, Verpackungsdaten.</w:t>
+            </w:r>
+          </w:p>
+          <w:p>
+            <w:pPr>
+              <w:spacing w:after="40" w:before="0"/>
+            </w:pPr>
+            <w:r>
+              <w:rPr>
+                <w:rFonts w:ascii="Times New Roman" w:hAnsi="Times New Roman" w:eastAsia="宋体" w:cs="Times New Roman"/>
+                <w:b w:val="0"/>
+                <w:sz w:val="21"/>
+              </w:rPr>
+              <w:t>Zweck: Durchführung dieser Vereinbarung (Kundenbetreuung, Abrechnung und Zahlungsabwicklung).</w:t>
+            </w:r>
+          </w:p>
+          <w:p>
+            <w:pPr>
+              <w:spacing w:after="40" w:before="0"/>
+            </w:pPr>
+            <w:r>
+              <w:rPr>
+                <w:rFonts w:ascii="Times New Roman" w:hAnsi="Times New Roman" w:eastAsia="宋体" w:cs="Times New Roman"/>
+                <w:b w:val="0"/>
+                <w:sz w:val="21"/>
+              </w:rPr>
+              <w:t>Häufigkeit: fortlaufend nach Bedarf.</w:t>
+            </w:r>
+          </w:p>
+          <w:p>
+            <w:pPr>
+              <w:spacing w:after="40" w:before="0"/>
+            </w:pPr>
+            <w:r>
+              <w:rPr>
+                <w:rFonts w:ascii="Times New Roman" w:hAnsi="Times New Roman" w:eastAsia="宋体" w:cs="Times New Roman"/>
+                <w:b w:val="0"/>
+                <w:sz w:val="21"/>
+              </w:rPr>
+              <w:t>Aufbewahrungsdauer: für die Dauer der Zusammenarbeit und die Dauer gesetzlicher Aufbewahrungspflichten.</w:t>
+            </w:r>
+          </w:p>
+        </w:tc>
+        <w:tc>
+          <w:tcPr>
+            <w:tcW w:type="dxa" w:w="4819"/>
+            <w:tcBorders>
+              <w:top w:val="nil"/>
+              <w:left w:val="nil"/>
+              <w:bottom w:val="nil"/>
+              <w:right w:val="nil"/>
+              <w:insideH w:val="nil"/>
+              <w:insideV w:val="nil"/>
+            </w:tcBorders>
+          </w:tcPr>
+          <w:p>
+            <w:pPr>
+              <w:spacing w:after="40" w:before="0"/>
+            </w:pPr>
+            <w:r>
+              <w:rPr>
+                <w:rFonts w:ascii="Times New Roman" w:hAnsi="Times New Roman" w:eastAsia="宋体" w:cs="Times New Roman"/>
+                <w:b w:val="0"/>
+                <w:sz w:val="21"/>
+              </w:rPr>
+              <w:t>(3) 附录 I B. – 传输描述：</w:t>
+            </w:r>
+          </w:p>
+          <w:p>
+            <w:pPr>
+              <w:spacing w:after="40" w:before="0"/>
+            </w:pPr>
+            <w:r>
+              <w:rPr>
+                <w:rFonts w:ascii="Times New Roman" w:hAnsi="Times New Roman" w:eastAsia="宋体" w:cs="Times New Roman"/>
+                <w:b w:val="0"/>
+                <w:sz w:val="21"/>
+              </w:rPr>
+              <w:t>数据主体类别：客户的联系人及法定代表人。</w:t>
+            </w:r>
+          </w:p>
+          <w:p>
+            <w:pPr>
+              <w:spacing w:after="40" w:before="0"/>
+            </w:pPr>
+            <w:r>
+              <w:rPr>
+                <w:rFonts w:ascii="Times New Roman" w:hAnsi="Times New Roman" w:eastAsia="宋体" w:cs="Times New Roman"/>
+                <w:b w:val="0"/>
+                <w:sz w:val="21"/>
+              </w:rPr>
+              <w:t>个人数据类别：姓名、公司名称、地址、电子邮箱、电话号码、微信号、税号、包装数据。</w:t>
+            </w:r>
+          </w:p>
+          <w:p>
+            <w:pPr>
+              <w:spacing w:after="40" w:before="0"/>
+            </w:pPr>
+            <w:r>
+              <w:rPr>
+                <w:rFonts w:ascii="Times New Roman" w:hAnsi="Times New Roman" w:eastAsia="宋体" w:cs="Times New Roman"/>
+                <w:b w:val="0"/>
+                <w:sz w:val="21"/>
+              </w:rPr>
+              <w:t>传输目的：履行本合同（客户维护、结算及支付处理）。</w:t>
+            </w:r>
+          </w:p>
+          <w:p>
+            <w:pPr>
+              <w:spacing w:after="40" w:before="0"/>
+            </w:pPr>
+            <w:r>
+              <w:rPr>
+                <w:rFonts w:ascii="Times New Roman" w:hAnsi="Times New Roman" w:eastAsia="宋体" w:cs="Times New Roman"/>
+                <w:b w:val="0"/>
+                <w:sz w:val="21"/>
+              </w:rPr>
+              <w:t>传输频率：持续、按需。</w:t>
+            </w:r>
+          </w:p>
+          <w:p>
+            <w:pPr>
+              <w:spacing w:after="40" w:before="0"/>
+            </w:pPr>
+            <w:r>
+              <w:rPr>
+                <w:rFonts w:ascii="Times New Roman" w:hAnsi="Times New Roman" w:eastAsia="宋体" w:cs="Times New Roman"/>
+                <w:b w:val="0"/>
+                <w:sz w:val="21"/>
+              </w:rPr>
+              <w:t>保留期限：合作期间及法定保存义务期间。</w:t>
+            </w:r>
+          </w:p>
+        </w:tc>
+      </w:tr>
+      <w:tr>
+        <w:tc>
+          <w:tcPr>
+            <w:tcW w:type="dxa" w:w="4819"/>
+            <w:tcBorders>
+              <w:top w:val="nil"/>
+              <w:left w:val="nil"/>
+              <w:bottom w:val="nil"/>
+              <w:right w:val="nil"/>
+              <w:insideH w:val="nil"/>
+              <w:insideV w:val="nil"/>
+            </w:tcBorders>
+          </w:tcPr>
+          <w:p>
+            <w:pPr>
+              <w:spacing w:after="40" w:before="0"/>
+            </w:pPr>
+            <w:r>
+              <w:rPr>
+                <w:rFonts w:ascii="Times New Roman" w:hAnsi="Times New Roman" w:eastAsia="宋体" w:cs="Times New Roman"/>
+                <w:b w:val="0"/>
+                <w:sz w:val="21"/>
+              </w:rPr>
+              <w:t>(4) Anhang I C. – Zuständige Aufsichtsbehörde: Landesbeauftragte für Datenschutz und Informationsfreiheit Nordrhein-Westfalen (LDI NRW).</w:t>
+            </w:r>
+          </w:p>
+        </w:tc>
+        <w:tc>
+          <w:tcPr>
+            <w:tcW w:type="dxa" w:w="4819"/>
+            <w:tcBorders>
+              <w:top w:val="nil"/>
+              <w:left w:val="nil"/>
+              <w:bottom w:val="nil"/>
+              <w:right w:val="nil"/>
+              <w:insideH w:val="nil"/>
+              <w:insideV w:val="nil"/>
+            </w:tcBorders>
+          </w:tcPr>
+          <w:p>
+            <w:pPr>
+              <w:spacing w:after="40" w:before="0"/>
+            </w:pPr>
+            <w:r>
+              <w:rPr>
+                <w:rFonts w:ascii="Times New Roman" w:hAnsi="Times New Roman" w:eastAsia="宋体" w:cs="Times New Roman"/>
+                <w:b w:val="0"/>
+                <w:sz w:val="21"/>
+              </w:rPr>
+              <w:t>(4) 附录 I C. – 主管监管机构：北莱茵-威斯特法伦州数据保护与信息自由专员（LDI NRW）。</w:t>
+            </w:r>
+          </w:p>
+        </w:tc>
+      </w:tr>
+      <w:tr>
+        <w:tc>
+          <w:tcPr>
+            <w:tcW w:type="dxa" w:w="4819"/>
+            <w:tcBorders>
+              <w:top w:val="nil"/>
+              <w:left w:val="nil"/>
+              <w:bottom w:val="nil"/>
+              <w:right w:val="nil"/>
+              <w:insideH w:val="nil"/>
+              <w:insideV w:val="nil"/>
+            </w:tcBorders>
+          </w:tcPr>
+          <w:p>
+            <w:pPr>
+              <w:spacing w:after="40" w:before="0"/>
+            </w:pPr>
+            <w:r>
+              <w:rPr>
+                <w:rFonts w:ascii="Times New Roman" w:hAnsi="Times New Roman" w:eastAsia="宋体" w:cs="Times New Roman"/>
+                <w:b w:val="0"/>
+                <w:sz w:val="21"/>
+              </w:rPr>
+              <w:t>(5) Anhang II. – Technische und organisatorische Maßnahmen: Verschlüsselung der Datenübertragung (TLS), Zugriffs- und Berechtigungskontrolle, vertrauliche Behandlung, Löschkonzept, Schutz vor unbefugtem Zugriff.</w:t>
+            </w:r>
+          </w:p>
+        </w:tc>
+        <w:tc>
+          <w:tcPr>
+            <w:tcW w:type="dxa" w:w="4819"/>
+            <w:tcBorders>
+              <w:top w:val="nil"/>
+              <w:left w:val="nil"/>
+              <w:bottom w:val="nil"/>
+              <w:right w:val="nil"/>
+              <w:insideH w:val="nil"/>
+              <w:insideV w:val="nil"/>
+            </w:tcBorders>
+          </w:tcPr>
+          <w:p>
+            <w:pPr>
+              <w:spacing w:after="40" w:before="0"/>
+            </w:pPr>
+            <w:r>
+              <w:rPr>
+                <w:rFonts w:ascii="Times New Roman" w:hAnsi="Times New Roman" w:eastAsia="宋体" w:cs="Times New Roman"/>
+                <w:b w:val="0"/>
+                <w:sz w:val="21"/>
+              </w:rPr>
+              <w:t>(5) 附录 II. – 技术与组织措施：数据传输加密（TLS）、访问与权限控制、数据的保密处理、删除方案、防止未经授权的访问。</w:t>
+            </w:r>
+          </w:p>
+        </w:tc>
+      </w:tr>
+      <w:tr>
+        <w:tc>
+          <w:tcPr>
+            <w:tcW w:type="dxa" w:w="4819"/>
+            <w:tcBorders>
+              <w:top w:val="nil"/>
+              <w:left w:val="nil"/>
+              <w:bottom w:val="nil"/>
+              <w:right w:val="nil"/>
+              <w:insideH w:val="nil"/>
+              <w:insideV w:val="nil"/>
+            </w:tcBorders>
+          </w:tcPr>
+          <w:p>
+            <w:pPr>
+              <w:spacing w:after="40" w:before="0"/>
+            </w:pPr>
+            <w:r>
+              <w:rPr>
+                <w:rFonts w:ascii="Times New Roman" w:hAnsi="Times New Roman" w:eastAsia="宋体" w:cs="Times New Roman"/>
+                <w:b w:val="0"/>
+                <w:sz w:val="21"/>
+              </w:rPr>
+              <w:t>(6) Für die Übermittlung personenbezogener Daten von FREDDY an LIVANTO (aus der Volksrepublik China nach Deutschland) gelten die Bestimmungen des chinesischen Gesetzes zum Schutz personenbezogener Informationen (PIPL); die Parteien schließen hierzu gesondert einen Standardvertrag für die Übermittlung personenbezogener Informationen ins Ausland ab.</w:t>
+            </w:r>
+          </w:p>
+        </w:tc>
+        <w:tc>
+          <w:tcPr>
+            <w:tcW w:type="dxa" w:w="4819"/>
+            <w:tcBorders>
+              <w:top w:val="nil"/>
+              <w:left w:val="nil"/>
+              <w:bottom w:val="nil"/>
+              <w:right w:val="nil"/>
+              <w:insideH w:val="nil"/>
+              <w:insideV w:val="nil"/>
+            </w:tcBorders>
+          </w:tcPr>
+          <w:p>
+            <w:pPr>
+              <w:spacing w:after="40" w:before="0"/>
+            </w:pPr>
+            <w:r>
+              <w:rPr>
+                <w:rFonts w:ascii="Times New Roman" w:hAnsi="Times New Roman" w:eastAsia="宋体" w:cs="Times New Roman"/>
+                <w:b w:val="0"/>
+                <w:sz w:val="21"/>
+              </w:rPr>
+              <w:t>(6) 对于福瑞笛向 LIVANTO（自中华人民共和国至德国）传输个人数据，适用中国《个人信息保护法》（PIPL）；双方就此另行签署《个人信息出境标准合同》。</w:t>
+            </w:r>
+          </w:p>
+        </w:tc>
+      </w:tr>
+    </w:tbl>
+    <w:tbl>
+      <w:tblPr>
+        <w:tblW w:type="dxa" w:w="97058"/>
+        <w:jc w:val="center"/>
+        <w:tblLayout w:type="fixed"/>
+        <w:tblLook w:firstColumn="1" w:firstRow="1" w:lastColumn="0" w:lastRow="0" w:noHBand="0" w:noVBand="1" w:val="04A0"/>
+      </w:tblPr>
+      <w:tblGrid>
+        <w:gridCol w:w="4853"/>
+        <w:gridCol w:w="4853"/>
+      </w:tblGrid>
+      <w:tr>
+        <w:tc>
+          <w:tcPr>
+            <w:tcW w:type="dxa" w:w="4819"/>
+            <w:tcBorders>
+              <w:top w:val="nil"/>
+              <w:left w:val="nil"/>
+              <w:bottom w:val="nil"/>
+              <w:right w:val="nil"/>
+              <w:insideH w:val="nil"/>
+              <w:insideV w:val="nil"/>
+            </w:tcBorders>
+          </w:tcPr>
+          <w:p>
+            <w:pPr>
+              <w:spacing w:after="40" w:before="0"/>
+            </w:pPr>
+            <w:r>
+              <w:rPr>
+                <w:rFonts w:ascii="Times New Roman" w:hAnsi="Times New Roman" w:eastAsia="宋体" w:cs="Times New Roman"/>
+                <w:b/>
+                <w:sz w:val="21"/>
+              </w:rPr>
               <w:t>Unterzeichnung</w:t>
             </w:r>
           </w:p>

</xml_diff>